<commit_message>
encourage line breaks in LaTeX around URLs
</commit_message>
<xml_diff>
--- a/example/result/e25_url_as_text.docx
+++ b/example/result/e25_url_as_text.docx
@@ -31,7 +31,7 @@
         <w:t>By not specifying the text, the URL is shows as text:</w:t>
       </w:r>
       <w:r>
-        <w:t>https://bitbucket.org/tom-bjorkholm/mformat/src/master/example</w:t>
+        <w:t xml:space="preserve"> https://bitbucket.org/tom-bjorkholm/mformat/src/master/example</w:t>
       </w:r>
     </w:p>
     <w:p>
@@ -54,7 +54,7 @@
       </w:r>
     </w:p>
     <w:sectPr>
-      <w:pgSz w:w="12240" w:h="15840"/>
+      <w:pgSz w:w="11906" w:h="16838"/>
       <w:pgMar w:top="1440" w:right="1800" w:bottom="1440" w:left="1800" w:header="720" w:footer="720" w:gutter="0"/>
       <w:cols w:space="720"/>
       <w:docGrid w:linePitch="360"/>

</xml_diff>